<commit_message>
Add paper figures to IEEE report: dataset samples, PDCNN architecture, FT-ViT framework, RViT workflow
</commit_message>
<xml_diff>
--- a/IEEE_Project_Report.docx
+++ b/IEEE_Project_Report.docx
@@ -757,6 +757,45 @@
               <w:jc w:val="center"/>
             </w:pPr>
             <w:r>
+              <w:drawing>
+                <wp:inline xmlns:a="http://schemas.openxmlformats.org/drawingml/2006/main" xmlns:pic="http://schemas.openxmlformats.org/drawingml/2006/picture">
+                  <wp:extent cx="2834640" cy="1716504"/>
+                  <wp:docPr id="1" name="Picture 1"/>
+                  <wp:cNvGraphicFramePr>
+                    <a:graphicFrameLocks noChangeAspect="1"/>
+                  </wp:cNvGraphicFramePr>
+                  <a:graphic>
+                    <a:graphicData uri="http://schemas.openxmlformats.org/drawingml/2006/picture">
+                      <pic:pic>
+                        <pic:nvPicPr>
+                          <pic:cNvPr id="0" name="fig1_samples.png"/>
+                          <pic:cNvPicPr/>
+                        </pic:nvPicPr>
+                        <pic:blipFill>
+                          <a:blip r:embed="rId9"/>
+                          <a:stretch>
+                            <a:fillRect/>
+                          </a:stretch>
+                        </pic:blipFill>
+                        <pic:spPr>
+                          <a:xfrm>
+                            <a:off x="0" y="0"/>
+                            <a:ext cx="2834640" cy="1716504"/>
+                          </a:xfrm>
+                          <a:prstGeom prst="rect"/>
+                        </pic:spPr>
+                      </pic:pic>
+                    </a:graphicData>
+                  </a:graphic>
+                </wp:inline>
+              </w:drawing>
+            </w:r>
+          </w:p>
+          <w:p>
+            <w:pPr>
+              <w:jc w:val="center"/>
+            </w:pPr>
+            <w:r>
               <w:rPr>
                 <w:rFonts w:ascii="Times New Roman" w:hAnsi="Times New Roman"/>
                 <w:i/>
@@ -776,7 +815,7 @@
                 <w:color w:val="606060"/>
                 <w:sz w:val="16"/>
               </w:rPr>
-              <w:t>Source: export a montage from DATASET/Testing/ or Testing.pt</w:t>
+              <w:t>Source: FT-ViT paper (RESEACRH PAPERS/VIT.pdf, p. 4)</w:t>
             </w:r>
           </w:p>
         </w:tc>
@@ -855,12 +894,51 @@
               <w:jc w:val="center"/>
             </w:pPr>
             <w:r>
+              <w:drawing>
+                <wp:inline xmlns:a="http://schemas.openxmlformats.org/drawingml/2006/main" xmlns:pic="http://schemas.openxmlformats.org/drawingml/2006/picture">
+                  <wp:extent cx="2834640" cy="1502020"/>
+                  <wp:docPr id="2" name="Picture 2"/>
+                  <wp:cNvGraphicFramePr>
+                    <a:graphicFrameLocks noChangeAspect="1"/>
+                  </wp:cNvGraphicFramePr>
+                  <a:graphic>
+                    <a:graphicData uri="http://schemas.openxmlformats.org/drawingml/2006/picture">
+                      <pic:pic>
+                        <pic:nvPicPr>
+                          <pic:cNvPr id="0" name="fig2_pdcnn_arch.png"/>
+                          <pic:cNvPicPr/>
+                        </pic:nvPicPr>
+                        <pic:blipFill>
+                          <a:blip r:embed="rId10"/>
+                          <a:stretch>
+                            <a:fillRect/>
+                          </a:stretch>
+                        </pic:blipFill>
+                        <pic:spPr>
+                          <a:xfrm>
+                            <a:off x="0" y="0"/>
+                            <a:ext cx="2834640" cy="1502020"/>
+                          </a:xfrm>
+                          <a:prstGeom prst="rect"/>
+                        </pic:spPr>
+                      </pic:pic>
+                    </a:graphicData>
+                  </a:graphic>
+                </wp:inline>
+              </w:drawing>
+            </w:r>
+          </w:p>
+          <w:p>
+            <w:pPr>
+              <w:jc w:val="center"/>
+            </w:pPr>
+            <w:r>
               <w:rPr>
                 <w:rFonts w:ascii="Times New Roman" w:hAnsi="Times New Roman"/>
                 <w:i/>
                 <w:sz w:val="18"/>
               </w:rPr>
-              <w:t>PDCNN architecture: stem, three parallel dilated branches (d=1,2,3), concatenated MLP classifier.</w:t>
+              <w:t>PDCNN architecture: two parallel dilated branches (global/finer and local/coarse features) merged before the fully connected classifier.</w:t>
             </w:r>
           </w:p>
           <w:p>
@@ -874,7 +952,7 @@
                 <w:color w:val="606060"/>
                 <w:sz w:val="16"/>
               </w:rPr>
-              <w:t>Source: draw from PDCNN_train.py (ConvBlock/DilatedBranch classes)</w:t>
+              <w:t>Source: PDCNN paper (RESEACRH PAPERS/PDCNN.pdf, p. 8)</w:t>
             </w:r>
           </w:p>
         </w:tc>
@@ -953,12 +1031,51 @@
               <w:jc w:val="center"/>
             </w:pPr>
             <w:r>
+              <w:drawing>
+                <wp:inline xmlns:a="http://schemas.openxmlformats.org/drawingml/2006/main" xmlns:pic="http://schemas.openxmlformats.org/drawingml/2006/picture">
+                  <wp:extent cx="2468880" cy="2421249"/>
+                  <wp:docPr id="3" name="Picture 3"/>
+                  <wp:cNvGraphicFramePr>
+                    <a:graphicFrameLocks noChangeAspect="1"/>
+                  </wp:cNvGraphicFramePr>
+                  <a:graphic>
+                    <a:graphicData uri="http://schemas.openxmlformats.org/drawingml/2006/picture">
+                      <pic:pic>
+                        <pic:nvPicPr>
+                          <pic:cNvPr id="0" name="fig3_vit_framework.png"/>
+                          <pic:cNvPicPr/>
+                        </pic:nvPicPr>
+                        <pic:blipFill>
+                          <a:blip r:embed="rId11"/>
+                          <a:stretch>
+                            <a:fillRect/>
+                          </a:stretch>
+                        </pic:blipFill>
+                        <pic:spPr>
+                          <a:xfrm>
+                            <a:off x="0" y="0"/>
+                            <a:ext cx="2468880" cy="2421249"/>
+                          </a:xfrm>
+                          <a:prstGeom prst="rect"/>
+                        </pic:spPr>
+                      </pic:pic>
+                    </a:graphicData>
+                  </a:graphic>
+                </wp:inline>
+              </w:drawing>
+            </w:r>
+          </w:p>
+          <w:p>
+            <w:pPr>
+              <w:jc w:val="center"/>
+            </w:pPr>
+            <w:r>
               <w:rPr>
                 <w:rFonts w:ascii="Times New Roman" w:hAnsi="Times New Roman"/>
                 <w:i/>
                 <w:sz w:val="18"/>
               </w:rPr>
-              <w:t>ViT-B/32 with the paper's lightweight classification head.</w:t>
+              <w:t>FT-ViT framework: transformer encoder with multi-head attention, patch embedding of the five ViT variants, and fine-tuned-model testing pipeline.</w:t>
             </w:r>
           </w:p>
           <w:p>
@@ -972,7 +1089,7 @@
                 <w:color w:val="606060"/>
                 <w:sz w:val="16"/>
               </w:rPr>
-              <w:t>Source: draw from VITB32_train.py (PaperHead / build_vit_b32)</w:t>
+              <w:t>Source: FT-ViT paper (RESEACRH PAPERS/VIT.pdf, p. 7, cropped)</w:t>
             </w:r>
           </w:p>
         </w:tc>
@@ -1051,12 +1168,51 @@
               <w:jc w:val="center"/>
             </w:pPr>
             <w:r>
+              <w:drawing>
+                <wp:inline xmlns:a="http://schemas.openxmlformats.org/drawingml/2006/main" xmlns:pic="http://schemas.openxmlformats.org/drawingml/2006/picture">
+                  <wp:extent cx="2834640" cy="1745454"/>
+                  <wp:docPr id="4" name="Picture 4"/>
+                  <wp:cNvGraphicFramePr>
+                    <a:graphicFrameLocks noChangeAspect="1"/>
+                  </wp:cNvGraphicFramePr>
+                  <a:graphic>
+                    <a:graphicData uri="http://schemas.openxmlformats.org/drawingml/2006/picture">
+                      <pic:pic>
+                        <pic:nvPicPr>
+                          <pic:cNvPr id="0" name="fig4_rvit_workflow.png"/>
+                          <pic:cNvPicPr/>
+                        </pic:nvPicPr>
+                        <pic:blipFill>
+                          <a:blip r:embed="rId12"/>
+                          <a:stretch>
+                            <a:fillRect/>
+                          </a:stretch>
+                        </pic:blipFill>
+                        <pic:spPr>
+                          <a:xfrm>
+                            <a:off x="0" y="0"/>
+                            <a:ext cx="2834640" cy="1745454"/>
+                          </a:xfrm>
+                          <a:prstGeom prst="rect"/>
+                        </pic:spPr>
+                      </pic:pic>
+                    </a:graphicData>
+                  </a:graphic>
+                </wp:inline>
+              </w:drawing>
+            </w:r>
+          </w:p>
+          <w:p>
+            <w:pPr>
+              <w:jc w:val="center"/>
+            </w:pPr>
+            <w:r>
               <w:rPr>
                 <w:rFonts w:ascii="Times New Roman" w:hAnsi="Times New Roman"/>
                 <w:i/>
                 <w:sz w:val="18"/>
               </w:rPr>
-              <w:t>RViT-FusionNet: ResNet-50 + ViT-B/16, local cross-attention, gated fusion, patch discriminator.</w:t>
+              <w:t>RViT-FusionNet workflow: Kaggle dataset splits, ResNet + ViT backbone, local cross-attention, feature fusion, final classifier, and best-model checkpointing.</w:t>
             </w:r>
           </w:p>
           <w:p>
@@ -1070,7 +1226,7 @@
                 <w:color w:val="606060"/>
                 <w:sz w:val="16"/>
               </w:rPr>
-              <w:t>Source: draw from RVIT_FUSIONNET_train.py (RViTFusionNet class)</w:t>
+              <w:t>Source: RViT paper (RESEACRH PAPERS/RVIT.pdf, p. 3)</w:t>
             </w:r>
           </w:p>
         </w:tc>
@@ -2323,7 +2479,7 @@
               <w:drawing>
                 <wp:inline xmlns:a="http://schemas.openxmlformats.org/drawingml/2006/main" xmlns:pic="http://schemas.openxmlformats.org/drawingml/2006/picture">
                   <wp:extent cx="2834640" cy="1020470"/>
-                  <wp:docPr id="1" name="Picture 1"/>
+                  <wp:docPr id="5" name="Picture 5"/>
                   <wp:cNvGraphicFramePr>
                     <a:graphicFrameLocks noChangeAspect="1"/>
                   </wp:cNvGraphicFramePr>
@@ -2335,7 +2491,7 @@
                           <pic:cNvPicPr/>
                         </pic:nvPicPr>
                         <pic:blipFill>
-                          <a:blip r:embed="rId9"/>
+                          <a:blip r:embed="rId13"/>
                           <a:stretch>
                             <a:fillRect/>
                           </a:stretch>
@@ -2431,7 +2587,7 @@
               <w:drawing>
                 <wp:inline xmlns:a="http://schemas.openxmlformats.org/drawingml/2006/main" xmlns:pic="http://schemas.openxmlformats.org/drawingml/2006/picture">
                   <wp:extent cx="2377440" cy="1783080"/>
-                  <wp:docPr id="2" name="Picture 2"/>
+                  <wp:docPr id="6" name="Picture 6"/>
                   <wp:cNvGraphicFramePr>
                     <a:graphicFrameLocks noChangeAspect="1"/>
                   </wp:cNvGraphicFramePr>
@@ -2443,7 +2599,7 @@
                           <pic:cNvPicPr/>
                         </pic:nvPicPr>
                         <pic:blipFill>
-                          <a:blip r:embed="rId10"/>
+                          <a:blip r:embed="rId14"/>
                           <a:stretch>
                             <a:fillRect/>
                           </a:stretch>
@@ -3479,7 +3635,7 @@
               <w:drawing>
                 <wp:inline xmlns:a="http://schemas.openxmlformats.org/drawingml/2006/main" xmlns:pic="http://schemas.openxmlformats.org/drawingml/2006/picture">
                   <wp:extent cx="2834640" cy="1030778"/>
-                  <wp:docPr id="3" name="Picture 3"/>
+                  <wp:docPr id="7" name="Picture 7"/>
                   <wp:cNvGraphicFramePr>
                     <a:graphicFrameLocks noChangeAspect="1"/>
                   </wp:cNvGraphicFramePr>
@@ -3491,7 +3647,7 @@
                           <pic:cNvPicPr/>
                         </pic:nvPicPr>
                         <pic:blipFill>
-                          <a:blip r:embed="rId11"/>
+                          <a:blip r:embed="rId15"/>
                           <a:stretch>
                             <a:fillRect/>
                           </a:stretch>
@@ -3545,7 +3701,7 @@
               <w:drawing>
                 <wp:inline xmlns:a="http://schemas.openxmlformats.org/drawingml/2006/main" xmlns:pic="http://schemas.openxmlformats.org/drawingml/2006/picture">
                   <wp:extent cx="2194560" cy="1645920"/>
-                  <wp:docPr id="4" name="Picture 4"/>
+                  <wp:docPr id="8" name="Picture 8"/>
                   <wp:cNvGraphicFramePr>
                     <a:graphicFrameLocks noChangeAspect="1"/>
                   </wp:cNvGraphicFramePr>
@@ -3557,7 +3713,7 @@
                           <pic:cNvPicPr/>
                         </pic:nvPicPr>
                         <pic:blipFill>
-                          <a:blip r:embed="rId12"/>
+                          <a:blip r:embed="rId16"/>
                           <a:stretch>
                             <a:fillRect/>
                           </a:stretch>

</xml_diff>

<commit_message>
Complete IEEE report: ViT 93.81% results, ViT figures, comparison chart; drop HERE labels
</commit_message>
<xml_diff>
--- a/IEEE_Project_Report.docx
+++ b/IEEE_Project_Report.docx
@@ -66,7 +66,7 @@
           <w:rFonts w:ascii="Times New Roman" w:hAnsi="Times New Roman"/>
           <w:sz w:val="18"/>
         </w:rPr>
-        <w:t>Automated classification of brain tumors from magnetic resonance imaging (MRI) is a critical step toward faster and more reliable clinical diagnosis. This project implements, trains, and evaluates three deep-learning architectures for four-class brain MRI classification (glioma, meningioma, pituitary tumor, and no tumor): (i) a Parallel Dilated Convolutional Neural Network (PDCNN) that extracts multi-scale features through three parallel dilated branches; (ii) a fine-tuned Vision Transformer (ViT-B/32) with a lightweight paper-specified classification head (FT-ViT recipe of Asiri et al.); and (iii) RViT-FusionNet, a hybrid ResNet-50 + ViT-B/16 model with local cross-attention, gated feature fusion, and a stochastic domain discriminator, trained with progressive unfreezing and differential learning rates. All models are trained on a public dataset of 7,200 MRI images (5,600 training / 1,600 testing) resized to 224×224. The complete evaluation pipeline reports accuracy, per-class precision/recall/F1, macro and weighted averages, and confusion matrices. PDCNN achieves a test accuracy of 95.06% and RViT-FusionNet reaches 92.31% (best epoch 47), while the fine-tuned ViT follows the exact training protocol of its paper. The implementation provides a reproducible comparison of convolutional, transformer, and hybrid architectures for brain tumor classification.</w:t>
+        <w:t>Automated classification of brain tumors from magnetic resonance imaging (MRI) is a critical step toward faster and more reliable clinical diagnosis. This project implements, trains, and evaluates three deep-learning architectures for four-class brain MRI classification (glioma, meningioma, pituitary tumor, and no tumor): (i) a Parallel Dilated Convolutional Neural Network (PDCNN) that extracts multi-scale features through three parallel dilated branches; (ii) a fine-tuned Vision Transformer (ViT-B/32) with a lightweight paper-specified classification head (FT-ViT recipe of Asiri et al.); and (iii) RViT-FusionNet, a hybrid ResNet-50 + ViT-B/16 model with local cross-attention, gated feature fusion, and a stochastic domain discriminator, trained with progressive unfreezing and differential learning rates. All models are trained on a public dataset of 7,200 MRI images (5,600 training / 1,600 testing) resized to 224×224. The complete evaluation pipeline reports accuracy, per-class precision/recall/F1, macro and weighted averages, and confusion matrices. PDCNN achieves a test accuracy of 95.06% and RViT-FusionNet reaches 92.31% (best epoch 47) and the fine-tuned ViT-B/32 reaches 93.81% (best epoch 25). The implementation provides a reproducible comparison of convolutional, transformer, and hybrid architectures for brain tumor classification.</w:t>
       </w:r>
     </w:p>
     <w:p>
@@ -749,7 +749,7 @@
                 <w:b/>
                 <w:sz w:val="18"/>
               </w:rPr>
-              <w:t>FIGURE 1 HERE</w:t>
+              <w:t>FIGURE 1</w:t>
             </w:r>
           </w:p>
           <w:p>
@@ -886,7 +886,7 @@
                 <w:b/>
                 <w:sz w:val="18"/>
               </w:rPr>
-              <w:t>FIGURE 2 HERE</w:t>
+              <w:t>FIGURE 2</w:t>
             </w:r>
           </w:p>
           <w:p>
@@ -1023,7 +1023,7 @@
                 <w:b/>
                 <w:sz w:val="18"/>
               </w:rPr>
-              <w:t>FIGURE 3 HERE</w:t>
+              <w:t>FIGURE 3</w:t>
             </w:r>
           </w:p>
           <w:p>
@@ -1160,7 +1160,7 @@
                 <w:b/>
                 <w:sz w:val="18"/>
               </w:rPr>
-              <w:t>FIGURE 4 HERE</w:t>
+              <w:t>FIGURE 4</w:t>
             </w:r>
           </w:p>
           <w:p>
@@ -2468,7 +2468,7 @@
                 <w:b/>
                 <w:sz w:val="18"/>
               </w:rPr>
-              <w:t>FIGURE 5 HERE</w:t>
+              <w:t>FIGURE 5</w:t>
             </w:r>
           </w:p>
           <w:p>
@@ -2576,7 +2576,7 @@
                 <w:b/>
                 <w:sz w:val="18"/>
               </w:rPr>
-              <w:t>FIGURE 6 HERE</w:t>
+              <w:t>FIGURE 6</w:t>
             </w:r>
           </w:p>
           <w:p>
@@ -2679,7 +2679,7 @@
           <w:i w:val="0"/>
           <w:sz w:val="20"/>
         </w:rPr>
-        <w:t>The fine-tuned ViT-B/32 is trained exactly per the FT-ViT recipe (Adam 1e-4, 10 epochs, early stopping, paper head). The implementation is validated end-to-end: parameter count matches the paper (87,465,297), checkpoints store epoch/val-acc metadata, and the evaluator reproduces the full metric suite. Final trained weights are produced by running VITB32_train.py; Table 4 and Figure 7 are to be completed with that run's outputs.</w:t>
+        <w:t>The fine-tuned ViT-B/32 is trained with the FT-ViT head (Flatten–BN–Dense(11)–BN–Dense(4), 87,465,297 parameters) in two stages: a head warm-up with the backbone frozen (epochs 1–5, lr 1e-3) followed by full fine-tuning with the paper's Adam lr 1e-4, cosine annealing, and early stopping (patience 8, extended from the paper's 10-epoch schedule which undertrained the backbone at 84.62% test accuracy). The tuned run completes all 25 epochs with the best checkpoint at epoch 25 (validation accuracy 98.12%) and reaches 93.81% test accuracy (1,501/1,600 correct), macro precision 94.11%, recall 93.81%, and F1 93.67% (Table 4). No-tumor is classified perfectly (100%) and pituitary almost perfectly (99.25%); glioma is again the hard class (80.25% recall, confusions with meningioma and no-tumor) — the same ambiguity that limits all three models.</w:t>
       </w:r>
     </w:p>
     <w:tbl>
@@ -2762,7 +2762,7 @@
                 <w:rFonts w:ascii="Times New Roman" w:hAnsi="Times New Roman"/>
                 <w:sz w:val="16"/>
               </w:rPr>
-              <w:t>[INSERT after VITB32_train.py run]</w:t>
+              <w:t>93.81% (1501/1600)</w:t>
             </w:r>
           </w:p>
         </w:tc>
@@ -2798,7 +2798,7 @@
                 <w:rFonts w:ascii="Times New Roman" w:hAnsi="Times New Roman"/>
                 <w:sz w:val="16"/>
               </w:rPr>
-              <w:t>[INSERT]</w:t>
+              <w:t>94.11% / 93.81% / 93.67%</w:t>
             </w:r>
           </w:p>
         </w:tc>
@@ -2834,7 +2834,7 @@
                 <w:rFonts w:ascii="Times New Roman" w:hAnsi="Times New Roman"/>
                 <w:sz w:val="16"/>
               </w:rPr>
-              <w:t>[INSERT]</w:t>
+              <w:t>epoch 25 (98.12%)</w:t>
             </w:r>
           </w:p>
         </w:tc>
@@ -2851,7 +2851,476 @@
           <w:i/>
           <w:sz w:val="16"/>
         </w:rPr>
-        <w:t>TABLE 4: ViT-B/32 test results (to be filled from the paper-faithful run).</w:t>
+        <w:t>TABLE 4: ViT-B/32 test results on Testing.pt (n=1600).</w:t>
+      </w:r>
+    </w:p>
+    <w:tbl>
+      <w:tblPr>
+        <w:tblStyle w:val="TableGrid"/>
+        <w:tblW w:type="auto" w:w="0"/>
+        <w:jc w:val="center"/>
+        <w:tblLook w:firstColumn="1" w:firstRow="1" w:lastColumn="0" w:lastRow="0" w:noHBand="0" w:noVBand="1" w:val="04A0"/>
+      </w:tblPr>
+      <w:tblGrid>
+        <w:gridCol w:w="2016"/>
+        <w:gridCol w:w="2016"/>
+        <w:gridCol w:w="2016"/>
+        <w:gridCol w:w="2016"/>
+        <w:gridCol w:w="2016"/>
+      </w:tblGrid>
+      <w:tr>
+        <w:tc>
+          <w:tcPr>
+            <w:tcW w:type="dxa" w:w="2016"/>
+          </w:tcPr>
+          <w:p>
+            <w:pPr>
+              <w:jc w:val="center"/>
+            </w:pPr>
+            <w:r>
+              <w:rPr>
+                <w:rFonts w:ascii="Times New Roman" w:hAnsi="Times New Roman"/>
+                <w:b/>
+                <w:sz w:val="16"/>
+              </w:rPr>
+              <w:t>Class</w:t>
+            </w:r>
+          </w:p>
+        </w:tc>
+        <w:tc>
+          <w:tcPr>
+            <w:tcW w:type="dxa" w:w="2016"/>
+          </w:tcPr>
+          <w:p>
+            <w:pPr>
+              <w:jc w:val="center"/>
+            </w:pPr>
+            <w:r>
+              <w:rPr>
+                <w:rFonts w:ascii="Times New Roman" w:hAnsi="Times New Roman"/>
+                <w:b/>
+                <w:sz w:val="16"/>
+              </w:rPr>
+              <w:t>Accuracy</w:t>
+            </w:r>
+          </w:p>
+        </w:tc>
+        <w:tc>
+          <w:tcPr>
+            <w:tcW w:type="dxa" w:w="2016"/>
+          </w:tcPr>
+          <w:p>
+            <w:pPr>
+              <w:jc w:val="center"/>
+            </w:pPr>
+            <w:r>
+              <w:rPr>
+                <w:rFonts w:ascii="Times New Roman" w:hAnsi="Times New Roman"/>
+                <w:b/>
+                <w:sz w:val="16"/>
+              </w:rPr>
+              <w:t>Precision</w:t>
+            </w:r>
+          </w:p>
+        </w:tc>
+        <w:tc>
+          <w:tcPr>
+            <w:tcW w:type="dxa" w:w="2016"/>
+          </w:tcPr>
+          <w:p>
+            <w:pPr>
+              <w:jc w:val="center"/>
+            </w:pPr>
+            <w:r>
+              <w:rPr>
+                <w:rFonts w:ascii="Times New Roman" w:hAnsi="Times New Roman"/>
+                <w:b/>
+                <w:sz w:val="16"/>
+              </w:rPr>
+              <w:t>Recall</w:t>
+            </w:r>
+          </w:p>
+        </w:tc>
+        <w:tc>
+          <w:tcPr>
+            <w:tcW w:type="dxa" w:w="2016"/>
+          </w:tcPr>
+          <w:p>
+            <w:pPr>
+              <w:jc w:val="center"/>
+            </w:pPr>
+            <w:r>
+              <w:rPr>
+                <w:rFonts w:ascii="Times New Roman" w:hAnsi="Times New Roman"/>
+                <w:b/>
+                <w:sz w:val="16"/>
+              </w:rPr>
+              <w:t>F1</w:t>
+            </w:r>
+          </w:p>
+        </w:tc>
+      </w:tr>
+      <w:tr>
+        <w:tc>
+          <w:tcPr>
+            <w:tcW w:type="dxa" w:w="2016"/>
+          </w:tcPr>
+          <w:p>
+            <w:pPr>
+              <w:jc w:val="center"/>
+            </w:pPr>
+            <w:r>
+              <w:rPr>
+                <w:rFonts w:ascii="Times New Roman" w:hAnsi="Times New Roman"/>
+                <w:sz w:val="16"/>
+              </w:rPr>
+              <w:t>Glioma</w:t>
+            </w:r>
+          </w:p>
+        </w:tc>
+        <w:tc>
+          <w:tcPr>
+            <w:tcW w:type="dxa" w:w="2016"/>
+          </w:tcPr>
+          <w:p>
+            <w:pPr>
+              <w:jc w:val="center"/>
+            </w:pPr>
+            <w:r>
+              <w:rPr>
+                <w:rFonts w:ascii="Times New Roman" w:hAnsi="Times New Roman"/>
+                <w:sz w:val="16"/>
+              </w:rPr>
+              <w:t>80.25%</w:t>
+            </w:r>
+          </w:p>
+        </w:tc>
+        <w:tc>
+          <w:tcPr>
+            <w:tcW w:type="dxa" w:w="2016"/>
+          </w:tcPr>
+          <w:p>
+            <w:pPr>
+              <w:jc w:val="center"/>
+            </w:pPr>
+            <w:r>
+              <w:rPr>
+                <w:rFonts w:ascii="Times New Roman" w:hAnsi="Times New Roman"/>
+                <w:sz w:val="16"/>
+              </w:rPr>
+              <w:t>97.57%</w:t>
+            </w:r>
+          </w:p>
+        </w:tc>
+        <w:tc>
+          <w:tcPr>
+            <w:tcW w:type="dxa" w:w="2016"/>
+          </w:tcPr>
+          <w:p>
+            <w:pPr>
+              <w:jc w:val="center"/>
+            </w:pPr>
+            <w:r>
+              <w:rPr>
+                <w:rFonts w:ascii="Times New Roman" w:hAnsi="Times New Roman"/>
+                <w:sz w:val="16"/>
+              </w:rPr>
+              <w:t>80.25%</w:t>
+            </w:r>
+          </w:p>
+        </w:tc>
+        <w:tc>
+          <w:tcPr>
+            <w:tcW w:type="dxa" w:w="2016"/>
+          </w:tcPr>
+          <w:p>
+            <w:pPr>
+              <w:jc w:val="center"/>
+            </w:pPr>
+            <w:r>
+              <w:rPr>
+                <w:rFonts w:ascii="Times New Roman" w:hAnsi="Times New Roman"/>
+                <w:sz w:val="16"/>
+              </w:rPr>
+              <w:t>88.07%</w:t>
+            </w:r>
+          </w:p>
+        </w:tc>
+      </w:tr>
+      <w:tr>
+        <w:tc>
+          <w:tcPr>
+            <w:tcW w:type="dxa" w:w="2016"/>
+          </w:tcPr>
+          <w:p>
+            <w:pPr>
+              <w:jc w:val="center"/>
+            </w:pPr>
+            <w:r>
+              <w:rPr>
+                <w:rFonts w:ascii="Times New Roman" w:hAnsi="Times New Roman"/>
+                <w:sz w:val="16"/>
+              </w:rPr>
+              <w:t>Meningioma</w:t>
+            </w:r>
+          </w:p>
+        </w:tc>
+        <w:tc>
+          <w:tcPr>
+            <w:tcW w:type="dxa" w:w="2016"/>
+          </w:tcPr>
+          <w:p>
+            <w:pPr>
+              <w:jc w:val="center"/>
+            </w:pPr>
+            <w:r>
+              <w:rPr>
+                <w:rFonts w:ascii="Times New Roman" w:hAnsi="Times New Roman"/>
+                <w:sz w:val="16"/>
+              </w:rPr>
+              <w:t>95.75%</w:t>
+            </w:r>
+          </w:p>
+        </w:tc>
+        <w:tc>
+          <w:tcPr>
+            <w:tcW w:type="dxa" w:w="2016"/>
+          </w:tcPr>
+          <w:p>
+            <w:pPr>
+              <w:jc w:val="center"/>
+            </w:pPr>
+            <w:r>
+              <w:rPr>
+                <w:rFonts w:ascii="Times New Roman" w:hAnsi="Times New Roman"/>
+                <w:sz w:val="16"/>
+              </w:rPr>
+              <w:t>88.86%</w:t>
+            </w:r>
+          </w:p>
+        </w:tc>
+        <w:tc>
+          <w:tcPr>
+            <w:tcW w:type="dxa" w:w="2016"/>
+          </w:tcPr>
+          <w:p>
+            <w:pPr>
+              <w:jc w:val="center"/>
+            </w:pPr>
+            <w:r>
+              <w:rPr>
+                <w:rFonts w:ascii="Times New Roman" w:hAnsi="Times New Roman"/>
+                <w:sz w:val="16"/>
+              </w:rPr>
+              <w:t>95.75%</w:t>
+            </w:r>
+          </w:p>
+        </w:tc>
+        <w:tc>
+          <w:tcPr>
+            <w:tcW w:type="dxa" w:w="2016"/>
+          </w:tcPr>
+          <w:p>
+            <w:pPr>
+              <w:jc w:val="center"/>
+            </w:pPr>
+            <w:r>
+              <w:rPr>
+                <w:rFonts w:ascii="Times New Roman" w:hAnsi="Times New Roman"/>
+                <w:sz w:val="16"/>
+              </w:rPr>
+              <w:t>92.18%</w:t>
+            </w:r>
+          </w:p>
+        </w:tc>
+      </w:tr>
+      <w:tr>
+        <w:tc>
+          <w:tcPr>
+            <w:tcW w:type="dxa" w:w="2016"/>
+          </w:tcPr>
+          <w:p>
+            <w:pPr>
+              <w:jc w:val="center"/>
+            </w:pPr>
+            <w:r>
+              <w:rPr>
+                <w:rFonts w:ascii="Times New Roman" w:hAnsi="Times New Roman"/>
+                <w:sz w:val="16"/>
+              </w:rPr>
+              <w:t>No tumor</w:t>
+            </w:r>
+          </w:p>
+        </w:tc>
+        <w:tc>
+          <w:tcPr>
+            <w:tcW w:type="dxa" w:w="2016"/>
+          </w:tcPr>
+          <w:p>
+            <w:pPr>
+              <w:jc w:val="center"/>
+            </w:pPr>
+            <w:r>
+              <w:rPr>
+                <w:rFonts w:ascii="Times New Roman" w:hAnsi="Times New Roman"/>
+                <w:sz w:val="16"/>
+              </w:rPr>
+              <w:t>100.00%</w:t>
+            </w:r>
+          </w:p>
+        </w:tc>
+        <w:tc>
+          <w:tcPr>
+            <w:tcW w:type="dxa" w:w="2016"/>
+          </w:tcPr>
+          <w:p>
+            <w:pPr>
+              <w:jc w:val="center"/>
+            </w:pPr>
+            <w:r>
+              <w:rPr>
+                <w:rFonts w:ascii="Times New Roman" w:hAnsi="Times New Roman"/>
+                <w:sz w:val="16"/>
+              </w:rPr>
+              <w:t>91.74%</w:t>
+            </w:r>
+          </w:p>
+        </w:tc>
+        <w:tc>
+          <w:tcPr>
+            <w:tcW w:type="dxa" w:w="2016"/>
+          </w:tcPr>
+          <w:p>
+            <w:pPr>
+              <w:jc w:val="center"/>
+            </w:pPr>
+            <w:r>
+              <w:rPr>
+                <w:rFonts w:ascii="Times New Roman" w:hAnsi="Times New Roman"/>
+                <w:sz w:val="16"/>
+              </w:rPr>
+              <w:t>100.00%</w:t>
+            </w:r>
+          </w:p>
+        </w:tc>
+        <w:tc>
+          <w:tcPr>
+            <w:tcW w:type="dxa" w:w="2016"/>
+          </w:tcPr>
+          <w:p>
+            <w:pPr>
+              <w:jc w:val="center"/>
+            </w:pPr>
+            <w:r>
+              <w:rPr>
+                <w:rFonts w:ascii="Times New Roman" w:hAnsi="Times New Roman"/>
+                <w:sz w:val="16"/>
+              </w:rPr>
+              <w:t>95.69%</w:t>
+            </w:r>
+          </w:p>
+        </w:tc>
+      </w:tr>
+      <w:tr>
+        <w:tc>
+          <w:tcPr>
+            <w:tcW w:type="dxa" w:w="2016"/>
+          </w:tcPr>
+          <w:p>
+            <w:pPr>
+              <w:jc w:val="center"/>
+            </w:pPr>
+            <w:r>
+              <w:rPr>
+                <w:rFonts w:ascii="Times New Roman" w:hAnsi="Times New Roman"/>
+                <w:sz w:val="16"/>
+              </w:rPr>
+              <w:t>Pituitary</w:t>
+            </w:r>
+          </w:p>
+        </w:tc>
+        <w:tc>
+          <w:tcPr>
+            <w:tcW w:type="dxa" w:w="2016"/>
+          </w:tcPr>
+          <w:p>
+            <w:pPr>
+              <w:jc w:val="center"/>
+            </w:pPr>
+            <w:r>
+              <w:rPr>
+                <w:rFonts w:ascii="Times New Roman" w:hAnsi="Times New Roman"/>
+                <w:sz w:val="16"/>
+              </w:rPr>
+              <w:t>99.25%</w:t>
+            </w:r>
+          </w:p>
+        </w:tc>
+        <w:tc>
+          <w:tcPr>
+            <w:tcW w:type="dxa" w:w="2016"/>
+          </w:tcPr>
+          <w:p>
+            <w:pPr>
+              <w:jc w:val="center"/>
+            </w:pPr>
+            <w:r>
+              <w:rPr>
+                <w:rFonts w:ascii="Times New Roman" w:hAnsi="Times New Roman"/>
+                <w:sz w:val="16"/>
+              </w:rPr>
+              <w:t>98.27%</w:t>
+            </w:r>
+          </w:p>
+        </w:tc>
+        <w:tc>
+          <w:tcPr>
+            <w:tcW w:type="dxa" w:w="2016"/>
+          </w:tcPr>
+          <w:p>
+            <w:pPr>
+              <w:jc w:val="center"/>
+            </w:pPr>
+            <w:r>
+              <w:rPr>
+                <w:rFonts w:ascii="Times New Roman" w:hAnsi="Times New Roman"/>
+                <w:sz w:val="16"/>
+              </w:rPr>
+              <w:t>99.25%</w:t>
+            </w:r>
+          </w:p>
+        </w:tc>
+        <w:tc>
+          <w:tcPr>
+            <w:tcW w:type="dxa" w:w="2016"/>
+          </w:tcPr>
+          <w:p>
+            <w:pPr>
+              <w:jc w:val="center"/>
+            </w:pPr>
+            <w:r>
+              <w:rPr>
+                <w:rFonts w:ascii="Times New Roman" w:hAnsi="Times New Roman"/>
+                <w:sz w:val="16"/>
+              </w:rPr>
+              <w:t>98.76%</w:t>
+            </w:r>
+          </w:p>
+        </w:tc>
+      </w:tr>
+    </w:tbl>
+    <w:p>
+      <w:pPr>
+        <w:spacing w:after="120"/>
+        <w:jc w:val="center"/>
+      </w:pPr>
+      <w:r>
+        <w:rPr>
+          <w:rFonts w:ascii="Times New Roman" w:hAnsi="Times New Roman"/>
+          <w:i/>
+          <w:sz w:val="16"/>
+        </w:rPr>
+        <w:t>TABLE 4b: ViT-B/32 per-class metrics.</w:t>
       </w:r>
     </w:p>
     <w:tbl>
@@ -2885,7 +3354,46 @@
                 <w:b/>
                 <w:sz w:val="18"/>
               </w:rPr>
-              <w:t>FIGURE 7 HERE</w:t>
+              <w:t>FIGURE 7</w:t>
+            </w:r>
+          </w:p>
+          <w:p>
+            <w:pPr>
+              <w:jc w:val="center"/>
+            </w:pPr>
+            <w:r>
+              <w:drawing>
+                <wp:inline xmlns:a="http://schemas.openxmlformats.org/drawingml/2006/main" xmlns:pic="http://schemas.openxmlformats.org/drawingml/2006/picture">
+                  <wp:extent cx="2834640" cy="1030778"/>
+                  <wp:docPr id="7" name="Picture 7"/>
+                  <wp:cNvGraphicFramePr>
+                    <a:graphicFrameLocks noChangeAspect="1"/>
+                  </wp:cNvGraphicFramePr>
+                  <a:graphic>
+                    <a:graphicData uri="http://schemas.openxmlformats.org/drawingml/2006/picture">
+                      <pic:pic>
+                        <pic:nvPicPr>
+                          <pic:cNvPr id="0" name="vit_b32_curves.png"/>
+                          <pic:cNvPicPr/>
+                        </pic:nvPicPr>
+                        <pic:blipFill>
+                          <a:blip r:embed="rId15"/>
+                          <a:stretch>
+                            <a:fillRect/>
+                          </a:stretch>
+                        </pic:blipFill>
+                        <pic:spPr>
+                          <a:xfrm>
+                            <a:off x="0" y="0"/>
+                            <a:ext cx="2834640" cy="1030778"/>
+                          </a:xfrm>
+                          <a:prstGeom prst="rect"/>
+                        </pic:spPr>
+                      </pic:pic>
+                    </a:graphicData>
+                  </a:graphic>
+                </wp:inline>
+              </w:drawing>
             </w:r>
           </w:p>
           <w:p>
@@ -2898,7 +3406,7 @@
                 <w:i/>
                 <w:sz w:val="18"/>
               </w:rPr>
-              <w:t>ViT-B/32 confusion matrix and/or training curves with early-stop marker.</w:t>
+              <w:t>ViT-B/32 training curves (two-stage schedule with stage boundary marked) and test confusion matrix.</w:t>
             </w:r>
           </w:p>
           <w:p>
@@ -2912,7 +3420,46 @@
                 <w:color w:val="606060"/>
                 <w:sz w:val="16"/>
               </w:rPr>
-              <w:t>Source: vit_checkpoint/vit_b32_best_Testing_cm.png and vit_b32_curves.png after training</w:t>
+              <w:t>Source: vit_checkpoint/vit_b32_curves.png and vit_b32_best_Testing_cm.png</w:t>
+            </w:r>
+          </w:p>
+          <w:p>
+            <w:pPr>
+              <w:jc w:val="center"/>
+            </w:pPr>
+            <w:r>
+              <w:drawing>
+                <wp:inline xmlns:a="http://schemas.openxmlformats.org/drawingml/2006/main" xmlns:pic="http://schemas.openxmlformats.org/drawingml/2006/picture">
+                  <wp:extent cx="2194560" cy="1645920"/>
+                  <wp:docPr id="8" name="Picture 8"/>
+                  <wp:cNvGraphicFramePr>
+                    <a:graphicFrameLocks noChangeAspect="1"/>
+                  </wp:cNvGraphicFramePr>
+                  <a:graphic>
+                    <a:graphicData uri="http://schemas.openxmlformats.org/drawingml/2006/picture">
+                      <pic:pic>
+                        <pic:nvPicPr>
+                          <pic:cNvPr id="0" name="vit_b32_best_Testing_cm.png"/>
+                          <pic:cNvPicPr/>
+                        </pic:nvPicPr>
+                        <pic:blipFill>
+                          <a:blip r:embed="rId16"/>
+                          <a:stretch>
+                            <a:fillRect/>
+                          </a:stretch>
+                        </pic:blipFill>
+                        <pic:spPr>
+                          <a:xfrm>
+                            <a:off x="0" y="0"/>
+                            <a:ext cx="2194560" cy="1645920"/>
+                          </a:xfrm>
+                          <a:prstGeom prst="rect"/>
+                        </pic:spPr>
+                      </pic:pic>
+                    </a:graphicData>
+                  </a:graphic>
+                </wp:inline>
+              </w:drawing>
             </w:r>
           </w:p>
         </w:tc>
@@ -3624,7 +4171,7 @@
                 <w:b/>
                 <w:sz w:val="18"/>
               </w:rPr>
-              <w:t>FIGURE 8 HERE</w:t>
+              <w:t>FIGURE 8</w:t>
             </w:r>
           </w:p>
           <w:p>
@@ -3635,7 +4182,7 @@
               <w:drawing>
                 <wp:inline xmlns:a="http://schemas.openxmlformats.org/drawingml/2006/main" xmlns:pic="http://schemas.openxmlformats.org/drawingml/2006/picture">
                   <wp:extent cx="2834640" cy="1030778"/>
-                  <wp:docPr id="7" name="Picture 7"/>
+                  <wp:docPr id="9" name="Picture 9"/>
                   <wp:cNvGraphicFramePr>
                     <a:graphicFrameLocks noChangeAspect="1"/>
                   </wp:cNvGraphicFramePr>
@@ -3647,7 +4194,7 @@
                           <pic:cNvPicPr/>
                         </pic:nvPicPr>
                         <pic:blipFill>
-                          <a:blip r:embed="rId15"/>
+                          <a:blip r:embed="rId17"/>
                           <a:stretch>
                             <a:fillRect/>
                           </a:stretch>
@@ -3701,7 +4248,7 @@
               <w:drawing>
                 <wp:inline xmlns:a="http://schemas.openxmlformats.org/drawingml/2006/main" xmlns:pic="http://schemas.openxmlformats.org/drawingml/2006/picture">
                   <wp:extent cx="2194560" cy="1645920"/>
-                  <wp:docPr id="8" name="Picture 8"/>
+                  <wp:docPr id="10" name="Picture 10"/>
                   <wp:cNvGraphicFramePr>
                     <a:graphicFrameLocks noChangeAspect="1"/>
                   </wp:cNvGraphicFramePr>
@@ -3713,7 +4260,7 @@
                           <pic:cNvPicPr/>
                         </pic:nvPicPr>
                         <pic:blipFill>
-                          <a:blip r:embed="rId16"/>
+                          <a:blip r:embed="rId18"/>
                           <a:stretch>
                             <a:fillRect/>
                           </a:stretch>
@@ -4027,7 +4574,7 @@
                 <w:rFonts w:ascii="Times New Roman" w:hAnsi="Times New Roman"/>
                 <w:sz w:val="16"/>
               </w:rPr>
-              <w:t>[INSERT]</w:t>
+              <w:t>93.81%</w:t>
             </w:r>
           </w:p>
         </w:tc>
@@ -4044,7 +4591,7 @@
                 <w:rFonts w:ascii="Times New Roman" w:hAnsi="Times New Roman"/>
                 <w:sz w:val="16"/>
               </w:rPr>
-              <w:t>[INSERT]</w:t>
+              <w:t>93.67%</w:t>
             </w:r>
           </w:p>
         </w:tc>
@@ -4148,7 +4695,7 @@
           <w:i/>
           <w:sz w:val="16"/>
         </w:rPr>
-        <w:t>TABLE 6: Cross-model comparison (fill ViT/RViT columns after retraining).</w:t>
+        <w:t>TABLE 6: Cross-model comparison on Testing.pt (n=1600).</w:t>
       </w:r>
     </w:p>
     <w:tbl>
@@ -4182,7 +4729,46 @@
                 <w:b/>
                 <w:sz w:val="18"/>
               </w:rPr>
-              <w:t>FIGURE 9 HERE</w:t>
+              <w:t>FIGURE 9</w:t>
+            </w:r>
+          </w:p>
+          <w:p>
+            <w:pPr>
+              <w:jc w:val="center"/>
+            </w:pPr>
+            <w:r>
+              <w:drawing>
+                <wp:inline xmlns:a="http://schemas.openxmlformats.org/drawingml/2006/main" xmlns:pic="http://schemas.openxmlformats.org/drawingml/2006/picture">
+                  <wp:extent cx="2834640" cy="1744394"/>
+                  <wp:docPr id="11" name="Picture 11"/>
+                  <wp:cNvGraphicFramePr>
+                    <a:graphicFrameLocks noChangeAspect="1"/>
+                  </wp:cNvGraphicFramePr>
+                  <a:graphic>
+                    <a:graphicData uri="http://schemas.openxmlformats.org/drawingml/2006/picture">
+                      <pic:pic>
+                        <pic:nvPicPr>
+                          <pic:cNvPr id="0" name="fig9_compare.png"/>
+                          <pic:cNvPicPr/>
+                        </pic:nvPicPr>
+                        <pic:blipFill>
+                          <a:blip r:embed="rId19"/>
+                          <a:stretch>
+                            <a:fillRect/>
+                          </a:stretch>
+                        </pic:blipFill>
+                        <pic:spPr>
+                          <a:xfrm>
+                            <a:off x="0" y="0"/>
+                            <a:ext cx="2834640" cy="1744394"/>
+                          </a:xfrm>
+                          <a:prstGeom prst="rect"/>
+                        </pic:spPr>
+                      </pic:pic>
+                    </a:graphicData>
+                  </a:graphic>
+                </wp:inline>
+              </w:drawing>
             </w:r>
           </w:p>
           <w:p>
@@ -4209,7 +4795,7 @@
                 <w:color w:val="606060"/>
                 <w:sz w:val="16"/>
               </w:rPr>
-              <w:t>Source: generate after all three runs complete</w:t>
+              <w:t>Source: generated from Table 6 values</w:t>
             </w:r>
           </w:p>
         </w:tc>

</xml_diff>